<commit_message>
Update course details and remove routine image
Deleted the routine PNG image, updated the course details DOCX, and added a new course details PDF. These changes reflect updated course information and remove outdated routine material.
</commit_message>
<xml_diff>
--- a/Routine/course details.docx
+++ b/Routine/course details.docx
@@ -204,7 +204,7 @@
             <w14:round/>
           </w14:textOutline>
         </w:rPr>
-        <w:t>Spring</w:t>
+        <w:t>Fall</w:t>
       </w:r>
       <w:r>
         <w:rPr>
@@ -354,7 +354,7 @@
           <w:szCs w:val="24"/>
           <w:u w:val="single"/>
         </w:rPr>
-        <w:t>3</w:t>
+        <w:t>4</w:t>
       </w:r>
       <w:r>
         <w:rPr>
@@ -366,7 +366,7 @@
           <w:u w:val="single"/>
           <w:vertAlign w:val="superscript"/>
         </w:rPr>
-        <w:t>rd</w:t>
+        <w:t>th</w:t>
       </w:r>
       <w:r>
         <w:rPr>
@@ -410,7 +410,7 @@
           <w:szCs w:val="24"/>
           <w:u w:val="single"/>
         </w:rPr>
-        <w:t>2</w:t>
+        <w:t>1</w:t>
       </w:r>
       <w:r>
         <w:rPr>
@@ -422,7 +422,7 @@
           <w:u w:val="single"/>
           <w:vertAlign w:val="superscript"/>
         </w:rPr>
-        <w:t>nd</w:t>
+        <w:t>st</w:t>
       </w:r>
       <w:r>
         <w:rPr>
@@ -661,8 +661,24 @@
                 <w:sz w:val="28"/>
                 <w:szCs w:val="28"/>
               </w:rPr>
-              <w:t>HUM</w:t>
-            </w:r>
+              <w:t>CSE 4101</w:t>
+            </w:r>
+          </w:p>
+        </w:tc>
+        <w:tc>
+          <w:tcPr>
+            <w:tcW w:w="3604" w:type="dxa"/>
+            <w:vAlign w:val="center"/>
+          </w:tcPr>
+          <w:p>
+            <w:pPr>
+              <w:jc w:val="center"/>
+              <w:rPr>
+                <w:rFonts w:ascii="Times New Roman" w:hAnsi="Times New Roman" w:cs="Times New Roman"/>
+                <w:sz w:val="28"/>
+                <w:szCs w:val="28"/>
+              </w:rPr>
+            </w:pPr>
             <w:r>
               <w:rPr>
                 <w:rFonts w:ascii="Times New Roman" w:hAnsi="Times New Roman" w:cs="Times New Roman"/>
@@ -677,31 +693,15 @@
                 <w:sz w:val="28"/>
                 <w:szCs w:val="28"/>
               </w:rPr>
-              <w:t>2202</w:t>
-            </w:r>
-          </w:p>
-        </w:tc>
-        <w:tc>
-          <w:tcPr>
-            <w:tcW w:w="3604" w:type="dxa"/>
-            <w:vAlign w:val="center"/>
-          </w:tcPr>
-          <w:p>
-            <w:pPr>
-              <w:jc w:val="center"/>
-              <w:rPr>
-                <w:rFonts w:ascii="Times New Roman" w:hAnsi="Times New Roman" w:cs="Times New Roman"/>
-                <w:sz w:val="28"/>
-                <w:szCs w:val="28"/>
-              </w:rPr>
-            </w:pPr>
-            <w:r>
-              <w:rPr>
-                <w:rFonts w:ascii="Times New Roman" w:hAnsi="Times New Roman" w:cs="Times New Roman"/>
-                <w:sz w:val="28"/>
-                <w:szCs w:val="28"/>
-              </w:rPr>
-              <w:t xml:space="preserve">Critical Approach to Sociology </w:t>
+              <w:t xml:space="preserve"> </w:t>
+            </w:r>
+            <w:r>
+              <w:rPr>
+                <w:rFonts w:ascii="Times New Roman" w:hAnsi="Times New Roman" w:cs="Times New Roman"/>
+                <w:sz w:val="28"/>
+                <w:szCs w:val="28"/>
+              </w:rPr>
+              <w:t>Project / Thesis (Phase-1)</w:t>
             </w:r>
           </w:p>
         </w:tc>
@@ -725,7 +725,7 @@
                 <w:sz w:val="28"/>
                 <w:szCs w:val="28"/>
               </w:rPr>
-              <w:t>2</w:t>
+              <w:t>3</w:t>
             </w:r>
             <w:r>
               <w:rPr>
@@ -757,14 +757,14 @@
                 <w:sz w:val="28"/>
                 <w:szCs w:val="28"/>
               </w:rPr>
-              <w:t>Sr. Henrieta</w:t>
+              <w:t>All</w:t>
             </w:r>
           </w:p>
         </w:tc>
       </w:tr>
       <w:tr>
         <w:trPr>
-          <w:trHeight w:val="1076"/>
+          <w:trHeight w:val="977"/>
         </w:trPr>
         <w:tc>
           <w:tcPr>
@@ -806,7 +806,7 @@
                 <w:sz w:val="28"/>
                 <w:szCs w:val="28"/>
               </w:rPr>
-              <w:t>HUM 2208</w:t>
+              <w:t>IPE 4102</w:t>
             </w:r>
           </w:p>
         </w:tc>
@@ -830,31 +830,7 @@
                 <w:sz w:val="28"/>
                 <w:szCs w:val="28"/>
               </w:rPr>
-              <w:t xml:space="preserve">Bangali Language &amp; </w:t>
-            </w:r>
-            <w:r>
-              <w:rPr>
-                <w:rFonts w:ascii="Times New Roman" w:hAnsi="Times New Roman" w:cs="Times New Roman"/>
-                <w:sz w:val="28"/>
-                <w:szCs w:val="28"/>
-              </w:rPr>
-              <w:t>Literature</w:t>
-            </w:r>
-            <w:r>
-              <w:rPr>
-                <w:rFonts w:ascii="Times New Roman" w:hAnsi="Times New Roman" w:cs="Times New Roman"/>
-                <w:sz w:val="28"/>
-                <w:szCs w:val="28"/>
-              </w:rPr>
-              <w:t xml:space="preserve"> </w:t>
-            </w:r>
-            <w:r>
-              <w:rPr>
-                <w:rFonts w:ascii="Times New Roman" w:hAnsi="Times New Roman" w:cs="Times New Roman"/>
-                <w:sz w:val="28"/>
-                <w:szCs w:val="28"/>
-              </w:rPr>
-              <w:t>&amp; History of Emergence of Bangladesh</w:t>
+              <w:t>Industrial Management</w:t>
             </w:r>
           </w:p>
         </w:tc>
@@ -878,23 +854,7 @@
                 <w:sz w:val="28"/>
                 <w:szCs w:val="28"/>
               </w:rPr>
-              <w:t>3</w:t>
-            </w:r>
-            <w:r>
-              <w:rPr>
-                <w:rFonts w:ascii="Times New Roman" w:hAnsi="Times New Roman" w:cs="Times New Roman"/>
-                <w:sz w:val="28"/>
-                <w:szCs w:val="28"/>
-              </w:rPr>
-              <w:t>.</w:t>
-            </w:r>
-            <w:r>
-              <w:rPr>
-                <w:rFonts w:ascii="Times New Roman" w:hAnsi="Times New Roman" w:cs="Times New Roman"/>
-                <w:sz w:val="28"/>
-                <w:szCs w:val="28"/>
-              </w:rPr>
-              <w:t>0</w:t>
+              <w:t>3.0</w:t>
             </w:r>
           </w:p>
         </w:tc>
@@ -918,14 +878,14 @@
                 <w:sz w:val="28"/>
                 <w:szCs w:val="28"/>
               </w:rPr>
-              <w:t>Momotaz ma’am</w:t>
+              <w:t>Md. Tahmid Hasan</w:t>
             </w:r>
           </w:p>
         </w:tc>
       </w:tr>
       <w:tr>
         <w:trPr>
-          <w:trHeight w:val="887"/>
+          <w:trHeight w:val="1076"/>
         </w:trPr>
         <w:tc>
           <w:tcPr>
@@ -967,7 +927,7 @@
                 <w:sz w:val="28"/>
                 <w:szCs w:val="28"/>
               </w:rPr>
-              <w:t>ACC 3201</w:t>
+              <w:t>CSE 4103</w:t>
             </w:r>
           </w:p>
         </w:tc>
@@ -991,7 +951,7 @@
                 <w:sz w:val="28"/>
                 <w:szCs w:val="28"/>
               </w:rPr>
-              <w:t xml:space="preserve">Accounting </w:t>
+              <w:t xml:space="preserve">Artificial Intelligence and Expert System </w:t>
             </w:r>
           </w:p>
         </w:tc>
@@ -1015,15 +975,23 @@
                 <w:sz w:val="28"/>
                 <w:szCs w:val="28"/>
               </w:rPr>
-              <w:t>2</w:t>
-            </w:r>
-            <w:r>
-              <w:rPr>
-                <w:rFonts w:ascii="Times New Roman" w:hAnsi="Times New Roman" w:cs="Times New Roman"/>
-                <w:sz w:val="28"/>
-                <w:szCs w:val="28"/>
-              </w:rPr>
-              <w:t>.0</w:t>
+              <w:t>3</w:t>
+            </w:r>
+            <w:r>
+              <w:rPr>
+                <w:rFonts w:ascii="Times New Roman" w:hAnsi="Times New Roman" w:cs="Times New Roman"/>
+                <w:sz w:val="28"/>
+                <w:szCs w:val="28"/>
+              </w:rPr>
+              <w:t>.</w:t>
+            </w:r>
+            <w:r>
+              <w:rPr>
+                <w:rFonts w:ascii="Times New Roman" w:hAnsi="Times New Roman" w:cs="Times New Roman"/>
+                <w:sz w:val="28"/>
+                <w:szCs w:val="28"/>
+              </w:rPr>
+              <w:t>0</w:t>
             </w:r>
           </w:p>
         </w:tc>
@@ -1047,14 +1015,14 @@
                 <w:sz w:val="28"/>
                 <w:szCs w:val="28"/>
               </w:rPr>
-              <w:t>Atikur Sir</w:t>
+              <w:t>Khorshed Alam</w:t>
             </w:r>
           </w:p>
         </w:tc>
       </w:tr>
       <w:tr>
         <w:trPr>
-          <w:trHeight w:val="986"/>
+          <w:trHeight w:val="887"/>
         </w:trPr>
         <w:tc>
           <w:tcPr>
@@ -1096,31 +1064,7 @@
                 <w:sz w:val="28"/>
                 <w:szCs w:val="28"/>
               </w:rPr>
-              <w:t>CSE 3</w:t>
-            </w:r>
-            <w:r>
-              <w:rPr>
-                <w:rFonts w:ascii="Times New Roman" w:hAnsi="Times New Roman" w:cs="Times New Roman"/>
-                <w:sz w:val="28"/>
-                <w:szCs w:val="28"/>
-              </w:rPr>
-              <w:t>2</w:t>
-            </w:r>
-            <w:r>
-              <w:rPr>
-                <w:rFonts w:ascii="Times New Roman" w:hAnsi="Times New Roman" w:cs="Times New Roman"/>
-                <w:sz w:val="28"/>
-                <w:szCs w:val="28"/>
-              </w:rPr>
-              <w:t>0</w:t>
-            </w:r>
-            <w:r>
-              <w:rPr>
-                <w:rFonts w:ascii="Times New Roman" w:hAnsi="Times New Roman" w:cs="Times New Roman"/>
-                <w:sz w:val="28"/>
-                <w:szCs w:val="28"/>
-              </w:rPr>
-              <w:t>2</w:t>
+              <w:t>CSE 4104</w:t>
             </w:r>
           </w:p>
         </w:tc>
@@ -1144,15 +1088,15 @@
                 <w:sz w:val="28"/>
                 <w:szCs w:val="28"/>
               </w:rPr>
-              <w:t xml:space="preserve">Compiler </w:t>
-            </w:r>
-            <w:r>
-              <w:rPr>
-                <w:rFonts w:ascii="Times New Roman" w:hAnsi="Times New Roman" w:cs="Times New Roman"/>
-                <w:sz w:val="28"/>
-                <w:szCs w:val="28"/>
-              </w:rPr>
-              <w:t>Architecture</w:t>
+              <w:t>Artificial Intelligence and Expert System</w:t>
+            </w:r>
+            <w:r>
+              <w:rPr>
+                <w:rFonts w:ascii="Times New Roman" w:hAnsi="Times New Roman" w:cs="Times New Roman"/>
+                <w:sz w:val="28"/>
+                <w:szCs w:val="28"/>
+              </w:rPr>
+              <w:t xml:space="preserve"> Lab</w:t>
             </w:r>
           </w:p>
         </w:tc>
@@ -1176,23 +1120,7 @@
                 <w:sz w:val="28"/>
                 <w:szCs w:val="28"/>
               </w:rPr>
-              <w:t>3</w:t>
-            </w:r>
-            <w:r>
-              <w:rPr>
-                <w:rFonts w:ascii="Times New Roman" w:hAnsi="Times New Roman" w:cs="Times New Roman"/>
-                <w:sz w:val="28"/>
-                <w:szCs w:val="28"/>
-              </w:rPr>
-              <w:t>.</w:t>
-            </w:r>
-            <w:r>
-              <w:rPr>
-                <w:rFonts w:ascii="Times New Roman" w:hAnsi="Times New Roman" w:cs="Times New Roman"/>
-                <w:sz w:val="28"/>
-                <w:szCs w:val="28"/>
-              </w:rPr>
-              <w:t>0</w:t>
+              <w:t>0.75</w:t>
             </w:r>
           </w:p>
         </w:tc>
@@ -1216,14 +1144,14 @@
                 <w:sz w:val="28"/>
                 <w:szCs w:val="28"/>
               </w:rPr>
-              <w:t>Nusrat ma’am</w:t>
+              <w:t>Khorshed Alam</w:t>
             </w:r>
           </w:p>
         </w:tc>
       </w:tr>
       <w:tr>
         <w:trPr>
-          <w:trHeight w:val="889"/>
+          <w:trHeight w:val="986"/>
         </w:trPr>
         <w:tc>
           <w:tcPr>
@@ -1265,15 +1193,71 @@
                 <w:sz w:val="28"/>
                 <w:szCs w:val="28"/>
               </w:rPr>
-              <w:t>CSE 3</w:t>
-            </w:r>
-            <w:r>
-              <w:rPr>
-                <w:rFonts w:ascii="Times New Roman" w:hAnsi="Times New Roman" w:cs="Times New Roman"/>
-                <w:sz w:val="28"/>
-                <w:szCs w:val="28"/>
-              </w:rPr>
-              <w:t>2</w:t>
+              <w:t xml:space="preserve">CSE </w:t>
+            </w:r>
+            <w:r>
+              <w:rPr>
+                <w:rFonts w:ascii="Times New Roman" w:hAnsi="Times New Roman" w:cs="Times New Roman"/>
+                <w:sz w:val="28"/>
+                <w:szCs w:val="28"/>
+              </w:rPr>
+              <w:t>4105</w:t>
+            </w:r>
+          </w:p>
+        </w:tc>
+        <w:tc>
+          <w:tcPr>
+            <w:tcW w:w="3604" w:type="dxa"/>
+            <w:vAlign w:val="center"/>
+          </w:tcPr>
+          <w:p>
+            <w:pPr>
+              <w:jc w:val="center"/>
+              <w:rPr>
+                <w:rFonts w:ascii="Times New Roman" w:hAnsi="Times New Roman" w:cs="Times New Roman"/>
+                <w:sz w:val="28"/>
+                <w:szCs w:val="28"/>
+              </w:rPr>
+            </w:pPr>
+            <w:r>
+              <w:rPr>
+                <w:rFonts w:ascii="Times New Roman" w:hAnsi="Times New Roman" w:cs="Times New Roman"/>
+                <w:sz w:val="28"/>
+                <w:szCs w:val="28"/>
+              </w:rPr>
+              <w:t xml:space="preserve">Digital System Design </w:t>
+            </w:r>
+          </w:p>
+        </w:tc>
+        <w:tc>
+          <w:tcPr>
+            <w:tcW w:w="2182" w:type="dxa"/>
+            <w:vAlign w:val="center"/>
+          </w:tcPr>
+          <w:p>
+            <w:pPr>
+              <w:jc w:val="center"/>
+              <w:rPr>
+                <w:rFonts w:ascii="Times New Roman" w:hAnsi="Times New Roman" w:cs="Times New Roman"/>
+                <w:sz w:val="28"/>
+                <w:szCs w:val="28"/>
+              </w:rPr>
+            </w:pPr>
+            <w:r>
+              <w:rPr>
+                <w:rFonts w:ascii="Times New Roman" w:hAnsi="Times New Roman" w:cs="Times New Roman"/>
+                <w:sz w:val="28"/>
+                <w:szCs w:val="28"/>
+              </w:rPr>
+              <w:t>3</w:t>
+            </w:r>
+            <w:r>
+              <w:rPr>
+                <w:rFonts w:ascii="Times New Roman" w:hAnsi="Times New Roman" w:cs="Times New Roman"/>
+                <w:sz w:val="28"/>
+                <w:szCs w:val="28"/>
+              </w:rPr>
+              <w:t>.</w:t>
             </w:r>
             <w:r>
               <w:rPr>
@@ -1283,70 +1267,6 @@
               </w:rPr>
               <w:t>0</w:t>
             </w:r>
-            <w:r>
-              <w:rPr>
-                <w:rFonts w:ascii="Times New Roman" w:hAnsi="Times New Roman" w:cs="Times New Roman"/>
-                <w:sz w:val="28"/>
-                <w:szCs w:val="28"/>
-              </w:rPr>
-              <w:t>3</w:t>
-            </w:r>
-          </w:p>
-        </w:tc>
-        <w:tc>
-          <w:tcPr>
-            <w:tcW w:w="3604" w:type="dxa"/>
-            <w:vAlign w:val="center"/>
-          </w:tcPr>
-          <w:p>
-            <w:pPr>
-              <w:jc w:val="center"/>
-              <w:rPr>
-                <w:rFonts w:ascii="Times New Roman" w:hAnsi="Times New Roman" w:cs="Times New Roman"/>
-                <w:sz w:val="28"/>
-                <w:szCs w:val="28"/>
-              </w:rPr>
-            </w:pPr>
-            <w:r>
-              <w:rPr>
-                <w:rFonts w:ascii="Times New Roman" w:hAnsi="Times New Roman" w:cs="Times New Roman"/>
-                <w:sz w:val="28"/>
-                <w:szCs w:val="28"/>
-              </w:rPr>
-              <w:t>Computer Networks</w:t>
-            </w:r>
-            <w:r>
-              <w:rPr>
-                <w:rFonts w:ascii="Times New Roman" w:hAnsi="Times New Roman" w:cs="Times New Roman"/>
-                <w:sz w:val="28"/>
-                <w:szCs w:val="28"/>
-              </w:rPr>
-              <w:t xml:space="preserve"> </w:t>
-            </w:r>
-          </w:p>
-        </w:tc>
-        <w:tc>
-          <w:tcPr>
-            <w:tcW w:w="2182" w:type="dxa"/>
-            <w:vAlign w:val="center"/>
-          </w:tcPr>
-          <w:p>
-            <w:pPr>
-              <w:jc w:val="center"/>
-              <w:rPr>
-                <w:rFonts w:ascii="Times New Roman" w:hAnsi="Times New Roman" w:cs="Times New Roman"/>
-                <w:sz w:val="28"/>
-                <w:szCs w:val="28"/>
-              </w:rPr>
-            </w:pPr>
-            <w:r>
-              <w:rPr>
-                <w:rFonts w:ascii="Times New Roman" w:hAnsi="Times New Roman" w:cs="Times New Roman"/>
-                <w:sz w:val="28"/>
-                <w:szCs w:val="28"/>
-              </w:rPr>
-              <w:t>3.0</w:t>
-            </w:r>
           </w:p>
         </w:tc>
         <w:tc>
@@ -1369,14 +1289,14 @@
                 <w:sz w:val="28"/>
                 <w:szCs w:val="28"/>
               </w:rPr>
-              <w:t>Fernaz ma’am</w:t>
+              <w:t>Rubyeat Islam</w:t>
             </w:r>
           </w:p>
         </w:tc>
       </w:tr>
       <w:tr>
         <w:trPr>
-          <w:trHeight w:val="970"/>
+          <w:trHeight w:val="889"/>
         </w:trPr>
         <w:tc>
           <w:tcPr>
@@ -1418,16 +1338,72 @@
                 <w:sz w:val="28"/>
                 <w:szCs w:val="28"/>
               </w:rPr>
-              <w:t>CSE 3</w:t>
-            </w:r>
-            <w:r>
-              <w:rPr>
-                <w:rFonts w:ascii="Times New Roman" w:hAnsi="Times New Roman" w:cs="Times New Roman"/>
-                <w:sz w:val="28"/>
-                <w:szCs w:val="28"/>
-              </w:rPr>
-              <w:t>2</w:t>
-            </w:r>
+              <w:t xml:space="preserve">CSE </w:t>
+            </w:r>
+            <w:r>
+              <w:rPr>
+                <w:rFonts w:ascii="Times New Roman" w:hAnsi="Times New Roman" w:cs="Times New Roman"/>
+                <w:sz w:val="28"/>
+                <w:szCs w:val="28"/>
+              </w:rPr>
+              <w:t>4106</w:t>
+            </w:r>
+          </w:p>
+        </w:tc>
+        <w:tc>
+          <w:tcPr>
+            <w:tcW w:w="3604" w:type="dxa"/>
+            <w:vAlign w:val="center"/>
+          </w:tcPr>
+          <w:p>
+            <w:pPr>
+              <w:jc w:val="center"/>
+              <w:rPr>
+                <w:rFonts w:ascii="Times New Roman" w:hAnsi="Times New Roman" w:cs="Times New Roman"/>
+                <w:sz w:val="28"/>
+                <w:szCs w:val="28"/>
+              </w:rPr>
+            </w:pPr>
+            <w:r>
+              <w:rPr>
+                <w:rFonts w:ascii="Times New Roman" w:hAnsi="Times New Roman" w:cs="Times New Roman"/>
+                <w:sz w:val="28"/>
+                <w:szCs w:val="28"/>
+              </w:rPr>
+              <w:t xml:space="preserve">Digital System Design </w:t>
+            </w:r>
+            <w:r>
+              <w:rPr>
+                <w:rFonts w:ascii="Times New Roman" w:hAnsi="Times New Roman" w:cs="Times New Roman"/>
+                <w:sz w:val="28"/>
+                <w:szCs w:val="28"/>
+              </w:rPr>
+              <w:t>Lab</w:t>
+            </w:r>
+            <w:r>
+              <w:rPr>
+                <w:rFonts w:ascii="Times New Roman" w:hAnsi="Times New Roman" w:cs="Times New Roman"/>
+                <w:sz w:val="28"/>
+                <w:szCs w:val="28"/>
+              </w:rPr>
+              <w:t xml:space="preserve"> </w:t>
+            </w:r>
+          </w:p>
+        </w:tc>
+        <w:tc>
+          <w:tcPr>
+            <w:tcW w:w="2182" w:type="dxa"/>
+            <w:vAlign w:val="center"/>
+          </w:tcPr>
+          <w:p>
+            <w:pPr>
+              <w:jc w:val="center"/>
+              <w:rPr>
+                <w:rFonts w:ascii="Times New Roman" w:hAnsi="Times New Roman" w:cs="Times New Roman"/>
+                <w:sz w:val="28"/>
+                <w:szCs w:val="28"/>
+              </w:rPr>
+            </w:pPr>
             <w:r>
               <w:rPr>
                 <w:rFonts w:ascii="Times New Roman" w:hAnsi="Times New Roman" w:cs="Times New Roman"/>
@@ -1442,63 +1418,15 @@
                 <w:sz w:val="28"/>
                 <w:szCs w:val="28"/>
               </w:rPr>
-              <w:t>4</w:t>
-            </w:r>
-          </w:p>
-        </w:tc>
-        <w:tc>
-          <w:tcPr>
-            <w:tcW w:w="3604" w:type="dxa"/>
-            <w:vAlign w:val="center"/>
-          </w:tcPr>
-          <w:p>
-            <w:pPr>
-              <w:jc w:val="center"/>
-              <w:rPr>
-                <w:rFonts w:ascii="Times New Roman" w:hAnsi="Times New Roman" w:cs="Times New Roman"/>
-                <w:sz w:val="28"/>
-                <w:szCs w:val="28"/>
-              </w:rPr>
-            </w:pPr>
-            <w:r>
-              <w:rPr>
-                <w:rFonts w:ascii="Times New Roman" w:hAnsi="Times New Roman" w:cs="Times New Roman"/>
-                <w:sz w:val="28"/>
-                <w:szCs w:val="28"/>
-              </w:rPr>
-              <w:t>Computer Networks</w:t>
-            </w:r>
-            <w:r>
-              <w:rPr>
-                <w:rFonts w:ascii="Times New Roman" w:hAnsi="Times New Roman" w:cs="Times New Roman"/>
-                <w:sz w:val="28"/>
-                <w:szCs w:val="28"/>
-              </w:rPr>
-              <w:t xml:space="preserve"> Lab</w:t>
-            </w:r>
-          </w:p>
-        </w:tc>
-        <w:tc>
-          <w:tcPr>
-            <w:tcW w:w="2182" w:type="dxa"/>
-            <w:vAlign w:val="center"/>
-          </w:tcPr>
-          <w:p>
-            <w:pPr>
-              <w:jc w:val="center"/>
-              <w:rPr>
-                <w:rFonts w:ascii="Times New Roman" w:hAnsi="Times New Roman" w:cs="Times New Roman"/>
-                <w:sz w:val="28"/>
-                <w:szCs w:val="28"/>
-              </w:rPr>
-            </w:pPr>
-            <w:r>
-              <w:rPr>
-                <w:rFonts w:ascii="Times New Roman" w:hAnsi="Times New Roman" w:cs="Times New Roman"/>
-                <w:sz w:val="28"/>
-                <w:szCs w:val="28"/>
-              </w:rPr>
-              <w:t>1.5</w:t>
+              <w:t>.</w:t>
+            </w:r>
+            <w:r>
+              <w:rPr>
+                <w:rFonts w:ascii="Times New Roman" w:hAnsi="Times New Roman" w:cs="Times New Roman"/>
+                <w:sz w:val="28"/>
+                <w:szCs w:val="28"/>
+              </w:rPr>
+              <w:t>75</w:t>
             </w:r>
           </w:p>
         </w:tc>
@@ -1522,14 +1450,14 @@
                 <w:sz w:val="28"/>
                 <w:szCs w:val="28"/>
               </w:rPr>
-              <w:t>Fernaz ma’am</w:t>
+              <w:t>Afsana Sharmin Shanta</w:t>
             </w:r>
           </w:p>
         </w:tc>
       </w:tr>
       <w:tr>
         <w:trPr>
-          <w:trHeight w:val="1004"/>
+          <w:trHeight w:val="970"/>
         </w:trPr>
         <w:tc>
           <w:tcPr>
@@ -1571,31 +1499,15 @@
                 <w:sz w:val="28"/>
                 <w:szCs w:val="28"/>
               </w:rPr>
-              <w:t>CSE 3</w:t>
-            </w:r>
-            <w:r>
-              <w:rPr>
-                <w:rFonts w:ascii="Times New Roman" w:hAnsi="Times New Roman" w:cs="Times New Roman"/>
-                <w:sz w:val="28"/>
-                <w:szCs w:val="28"/>
-              </w:rPr>
-              <w:t>2</w:t>
-            </w:r>
-            <w:r>
-              <w:rPr>
-                <w:rFonts w:ascii="Times New Roman" w:hAnsi="Times New Roman" w:cs="Times New Roman"/>
-                <w:sz w:val="28"/>
-                <w:szCs w:val="28"/>
-              </w:rPr>
-              <w:t>0</w:t>
-            </w:r>
-            <w:r>
-              <w:rPr>
-                <w:rFonts w:ascii="Times New Roman" w:hAnsi="Times New Roman" w:cs="Times New Roman"/>
-                <w:sz w:val="28"/>
-                <w:szCs w:val="28"/>
-              </w:rPr>
-              <w:t>5</w:t>
+              <w:t xml:space="preserve">CSE </w:t>
+            </w:r>
+            <w:r>
+              <w:rPr>
+                <w:rFonts w:ascii="Times New Roman" w:hAnsi="Times New Roman" w:cs="Times New Roman"/>
+                <w:sz w:val="28"/>
+                <w:szCs w:val="28"/>
+              </w:rPr>
+              <w:t>4110</w:t>
             </w:r>
           </w:p>
         </w:tc>
@@ -1619,7 +1531,15 @@
                 <w:sz w:val="28"/>
                 <w:szCs w:val="28"/>
               </w:rPr>
-              <w:t>Operating System</w:t>
+              <w:t xml:space="preserve">Digital </w:t>
+            </w:r>
+            <w:r>
+              <w:rPr>
+                <w:rFonts w:ascii="Times New Roman" w:hAnsi="Times New Roman" w:cs="Times New Roman"/>
+                <w:sz w:val="28"/>
+                <w:szCs w:val="28"/>
+              </w:rPr>
+              <w:t xml:space="preserve">Image Processing  </w:t>
             </w:r>
           </w:p>
         </w:tc>
@@ -1667,14 +1587,14 @@
                 <w:sz w:val="28"/>
                 <w:szCs w:val="28"/>
               </w:rPr>
-              <w:t>Khorshed Alam</w:t>
+              <w:t>Tabeen Ma’am</w:t>
             </w:r>
           </w:p>
         </w:tc>
       </w:tr>
       <w:tr>
         <w:trPr>
-          <w:trHeight w:val="797"/>
+          <w:trHeight w:val="970"/>
         </w:trPr>
         <w:tc>
           <w:tcPr>
@@ -1683,10 +1603,6 @@
           <w:p>
             <w:pPr>
               <w:pStyle w:val="ListParagraph"/>
-              <w:numPr>
-                <w:ilvl w:val="0"/>
-                <w:numId w:val="1"/>
-              </w:numPr>
               <w:ind w:left="360"/>
               <w:rPr>
                 <w:rFonts w:ascii="Times New Roman" w:hAnsi="Times New Roman" w:cs="Times New Roman"/>
@@ -1710,38 +1626,6 @@
                 <w:szCs w:val="28"/>
               </w:rPr>
             </w:pPr>
-            <w:r>
-              <w:rPr>
-                <w:rFonts w:ascii="Times New Roman" w:hAnsi="Times New Roman" w:cs="Times New Roman"/>
-                <w:sz w:val="28"/>
-                <w:szCs w:val="28"/>
-              </w:rPr>
-              <w:t>CSE 3</w:t>
-            </w:r>
-            <w:r>
-              <w:rPr>
-                <w:rFonts w:ascii="Times New Roman" w:hAnsi="Times New Roman" w:cs="Times New Roman"/>
-                <w:sz w:val="28"/>
-                <w:szCs w:val="28"/>
-              </w:rPr>
-              <w:t>2</w:t>
-            </w:r>
-            <w:r>
-              <w:rPr>
-                <w:rFonts w:ascii="Times New Roman" w:hAnsi="Times New Roman" w:cs="Times New Roman"/>
-                <w:sz w:val="28"/>
-                <w:szCs w:val="28"/>
-              </w:rPr>
-              <w:t>0</w:t>
-            </w:r>
-            <w:r>
-              <w:rPr>
-                <w:rFonts w:ascii="Times New Roman" w:hAnsi="Times New Roman" w:cs="Times New Roman"/>
-                <w:sz w:val="28"/>
-                <w:szCs w:val="28"/>
-              </w:rPr>
-              <w:t>6</w:t>
-            </w:r>
           </w:p>
         </w:tc>
         <w:tc>
@@ -1754,17 +1638,41 @@
               <w:jc w:val="center"/>
               <w:rPr>
                 <w:rFonts w:ascii="Times New Roman" w:hAnsi="Times New Roman" w:cs="Times New Roman"/>
-                <w:sz w:val="28"/>
-                <w:szCs w:val="28"/>
-              </w:rPr>
-            </w:pPr>
-            <w:r>
-              <w:rPr>
-                <w:rFonts w:ascii="Times New Roman" w:hAnsi="Times New Roman" w:cs="Times New Roman"/>
-                <w:sz w:val="28"/>
-                <w:szCs w:val="28"/>
-              </w:rPr>
-              <w:t>Operating System Lab</w:t>
+                <w:b/>
+                <w:bCs/>
+                <w:sz w:val="28"/>
+                <w:szCs w:val="28"/>
+              </w:rPr>
+            </w:pPr>
+            <w:r>
+              <w:rPr>
+                <w:rFonts w:ascii="Times New Roman" w:hAnsi="Times New Roman" w:cs="Times New Roman"/>
+                <w:b/>
+                <w:bCs/>
+                <w:sz w:val="28"/>
+                <w:szCs w:val="28"/>
+              </w:rPr>
+              <w:t xml:space="preserve">Total </w:t>
+            </w:r>
+            <w:r>
+              <w:rPr>
+                <w:rFonts w:ascii="Times New Roman" w:hAnsi="Times New Roman" w:cs="Times New Roman"/>
+                <w:b/>
+                <w:bCs/>
+                <w:sz w:val="28"/>
+                <w:szCs w:val="28"/>
+              </w:rPr>
+              <w:t>Credit:</w:t>
+            </w:r>
+            <w:r>
+              <w:rPr>
+                <w:rFonts w:ascii="Times New Roman" w:hAnsi="Times New Roman" w:cs="Times New Roman"/>
+                <w:b/>
+                <w:bCs/>
+                <w:sz w:val="28"/>
+                <w:szCs w:val="28"/>
+              </w:rPr>
+              <w:t xml:space="preserve"> </w:t>
             </w:r>
           </w:p>
         </w:tc>
@@ -1778,33 +1686,21 @@
               <w:jc w:val="center"/>
               <w:rPr>
                 <w:rFonts w:ascii="Times New Roman" w:hAnsi="Times New Roman" w:cs="Times New Roman"/>
-                <w:sz w:val="28"/>
-                <w:szCs w:val="28"/>
-              </w:rPr>
-            </w:pPr>
-            <w:r>
-              <w:rPr>
-                <w:rFonts w:ascii="Times New Roman" w:hAnsi="Times New Roman" w:cs="Times New Roman"/>
-                <w:sz w:val="28"/>
-                <w:szCs w:val="28"/>
-              </w:rPr>
-              <w:t>1</w:t>
-            </w:r>
-            <w:r>
-              <w:rPr>
-                <w:rFonts w:ascii="Times New Roman" w:hAnsi="Times New Roman" w:cs="Times New Roman"/>
-                <w:sz w:val="28"/>
-                <w:szCs w:val="28"/>
-              </w:rPr>
-              <w:t>.</w:t>
-            </w:r>
-            <w:r>
-              <w:rPr>
-                <w:rFonts w:ascii="Times New Roman" w:hAnsi="Times New Roman" w:cs="Times New Roman"/>
-                <w:sz w:val="28"/>
-                <w:szCs w:val="28"/>
-              </w:rPr>
-              <w:t>5</w:t>
+                <w:b/>
+                <w:bCs/>
+                <w:sz w:val="28"/>
+                <w:szCs w:val="28"/>
+              </w:rPr>
+            </w:pPr>
+            <w:r>
+              <w:rPr>
+                <w:rFonts w:ascii="Times New Roman" w:hAnsi="Times New Roman" w:cs="Times New Roman"/>
+                <w:b/>
+                <w:bCs/>
+                <w:sz w:val="28"/>
+                <w:szCs w:val="28"/>
+              </w:rPr>
+              <w:t>16.50</w:t>
             </w:r>
           </w:p>
         </w:tc>
@@ -1818,154 +1714,31 @@
               <w:jc w:val="center"/>
               <w:rPr>
                 <w:rFonts w:ascii="Times New Roman" w:hAnsi="Times New Roman" w:cs="Times New Roman"/>
-                <w:sz w:val="28"/>
-                <w:szCs w:val="28"/>
-              </w:rPr>
-            </w:pPr>
-            <w:r>
-              <w:rPr>
-                <w:rFonts w:ascii="Times New Roman" w:hAnsi="Times New Roman" w:cs="Times New Roman"/>
-                <w:sz w:val="28"/>
-                <w:szCs w:val="28"/>
-              </w:rPr>
-              <w:t>Khorshed Alam</w:t>
-            </w:r>
-          </w:p>
-        </w:tc>
-      </w:tr>
-      <w:tr>
-        <w:trPr>
-          <w:trHeight w:val="887"/>
-        </w:trPr>
-        <w:tc>
-          <w:tcPr>
-            <w:tcW w:w="566" w:type="dxa"/>
-          </w:tcPr>
-          <w:p>
-            <w:pPr>
-              <w:pStyle w:val="ListParagraph"/>
-              <w:numPr>
-                <w:ilvl w:val="0"/>
-                <w:numId w:val="1"/>
-              </w:numPr>
-              <w:ind w:left="360"/>
-              <w:rPr>
-                <w:rFonts w:ascii="Times New Roman" w:hAnsi="Times New Roman" w:cs="Times New Roman"/>
-                <w:sz w:val="28"/>
-                <w:szCs w:val="28"/>
-              </w:rPr>
-            </w:pPr>
-          </w:p>
-        </w:tc>
-        <w:tc>
-          <w:tcPr>
-            <w:tcW w:w="2219" w:type="dxa"/>
-            <w:vAlign w:val="center"/>
-          </w:tcPr>
-          <w:p>
-            <w:pPr>
-              <w:jc w:val="center"/>
-              <w:rPr>
-                <w:rFonts w:ascii="Times New Roman" w:hAnsi="Times New Roman" w:cs="Times New Roman"/>
-                <w:sz w:val="28"/>
-                <w:szCs w:val="28"/>
-              </w:rPr>
-            </w:pPr>
-            <w:r>
-              <w:rPr>
-                <w:rFonts w:ascii="Times New Roman" w:hAnsi="Times New Roman" w:cs="Times New Roman"/>
-                <w:sz w:val="28"/>
-                <w:szCs w:val="28"/>
-              </w:rPr>
-              <w:t>CSE 3207</w:t>
-            </w:r>
-          </w:p>
-        </w:tc>
-        <w:tc>
-          <w:tcPr>
-            <w:tcW w:w="3604" w:type="dxa"/>
-            <w:vAlign w:val="center"/>
-          </w:tcPr>
-          <w:p>
-            <w:pPr>
-              <w:jc w:val="center"/>
-              <w:rPr>
-                <w:rFonts w:ascii="Times New Roman" w:hAnsi="Times New Roman" w:cs="Times New Roman"/>
-                <w:sz w:val="28"/>
-                <w:szCs w:val="28"/>
-              </w:rPr>
-            </w:pPr>
-            <w:r>
-              <w:rPr>
-                <w:rFonts w:ascii="Times New Roman" w:hAnsi="Times New Roman" w:cs="Times New Roman"/>
-                <w:sz w:val="28"/>
-                <w:szCs w:val="28"/>
-              </w:rPr>
-              <w:t xml:space="preserve">Technical Writing and Presentation </w:t>
-            </w:r>
-          </w:p>
-        </w:tc>
-        <w:tc>
-          <w:tcPr>
-            <w:tcW w:w="2182" w:type="dxa"/>
-            <w:vAlign w:val="center"/>
-          </w:tcPr>
-          <w:p>
-            <w:pPr>
-              <w:jc w:val="center"/>
-              <w:rPr>
-                <w:rFonts w:ascii="Times New Roman" w:hAnsi="Times New Roman" w:cs="Times New Roman"/>
-                <w:sz w:val="28"/>
-                <w:szCs w:val="28"/>
-              </w:rPr>
-            </w:pPr>
-            <w:r>
-              <w:rPr>
-                <w:rFonts w:ascii="Times New Roman" w:hAnsi="Times New Roman" w:cs="Times New Roman"/>
-                <w:sz w:val="28"/>
-                <w:szCs w:val="28"/>
-              </w:rPr>
-              <w:t>0</w:t>
-            </w:r>
-            <w:r>
-              <w:rPr>
-                <w:rFonts w:ascii="Times New Roman" w:hAnsi="Times New Roman" w:cs="Times New Roman"/>
-                <w:sz w:val="28"/>
-                <w:szCs w:val="28"/>
-              </w:rPr>
-              <w:t>.</w:t>
-            </w:r>
-            <w:r>
-              <w:rPr>
-                <w:rFonts w:ascii="Times New Roman" w:hAnsi="Times New Roman" w:cs="Times New Roman"/>
-                <w:sz w:val="28"/>
-                <w:szCs w:val="28"/>
-              </w:rPr>
-              <w:t>75</w:t>
-            </w:r>
-          </w:p>
-        </w:tc>
-        <w:tc>
-          <w:tcPr>
-            <w:tcW w:w="2219" w:type="dxa"/>
-            <w:vAlign w:val="center"/>
-          </w:tcPr>
-          <w:p>
-            <w:pPr>
-              <w:jc w:val="center"/>
-              <w:rPr>
-                <w:rFonts w:ascii="Times New Roman" w:hAnsi="Times New Roman" w:cs="Times New Roman"/>
-                <w:sz w:val="28"/>
-                <w:szCs w:val="28"/>
-              </w:rPr>
-            </w:pPr>
-            <w:r>
-              <w:rPr>
-                <w:rFonts w:ascii="Times New Roman" w:hAnsi="Times New Roman" w:cs="Times New Roman"/>
-                <w:sz w:val="28"/>
-                <w:szCs w:val="28"/>
-              </w:rPr>
-              <w:t>Tahmid Sir</w:t>
+                <w:b/>
+                <w:bCs/>
+                <w:sz w:val="28"/>
+                <w:szCs w:val="28"/>
+              </w:rPr>
+            </w:pPr>
+            <w:r>
+              <w:rPr>
+                <w:rFonts w:ascii="Times New Roman" w:hAnsi="Times New Roman" w:cs="Times New Roman"/>
+                <w:b/>
+                <w:bCs/>
+                <w:sz w:val="28"/>
+                <w:szCs w:val="28"/>
+              </w:rPr>
+              <w:t xml:space="preserve">Semester fee:  </w:t>
+            </w:r>
+            <w:r>
+              <w:rPr>
+                <w:rFonts w:ascii="Times New Roman" w:hAnsi="Times New Roman" w:cs="Times New Roman"/>
+                <w:b/>
+                <w:bCs/>
+                <w:sz w:val="28"/>
+                <w:szCs w:val="28"/>
+              </w:rPr>
+              <w:t xml:space="preserve">80250/- </w:t>
             </w:r>
           </w:p>
         </w:tc>

</xml_diff>